<commit_message>
fix(packing): 템플릿 제목 "PACKING  LIS T" → "PACKING LIST"
PDF→DOCX 변환 잔재로 제목이 5개 run(음수 자간 포함)으로 쪼개져
미리보기·다운로드에서 글자가 벌어져 보이던 문제. 단일 run으로
병합하고 원본 자간(24)·장평(90%) 유지.

Co-Authored-By: Claude Opus 4.7 <noreply@anthropic.com>
</commit_message>
<xml_diff>
--- a/templates/packing_list_template.docx
+++ b/templates/packing_list_template.docx
@@ -14,34 +14,7 @@
           <w:spacing w:val="24"/>
           <w:w w:val="90"/>
         </w:rPr>
-        <w:t>PACKING</w:t>
-      </w:r>
-      <w:r>
-        <w:rPr>
-          <w:spacing w:val="25"/>
-        </w:rPr>
-        <w:t>  </w:t>
-      </w:r>
-      <w:r>
-        <w:rPr>
-          <w:spacing w:val="17"/>
-          <w:w w:val="90"/>
-        </w:rPr>
-        <w:t>LIS</w:t>
-      </w:r>
-      <w:r>
-        <w:rPr>
-          <w:spacing w:val="-21"/>
-          <w:w w:val="90"/>
-        </w:rPr>
-        <w:t> </w:t>
-      </w:r>
-      <w:r>
-        <w:rPr>
-          <w:spacing w:val="-10"/>
-          <w:w w:val="90"/>
-        </w:rPr>
-        <w:t>T</w:t>
+        <w:t xml:space="preserve">PACKING LIST</w:t>
       </w:r>
     </w:p>
     <w:p>

</xml_diff>